<commit_message>
Publish five certified Alder Ridge sample tasks
</commit_message>
<xml_diff>
--- a/environment/seed/sources/Shared/Finance/Corporate Development/Active analyses/IC diligence review notes - 7.5 DC.docx
+++ b/environment/seed/sources/Shared/Finance/Corporate Development/Active analyses/IC diligence review notes - 7.5 DC.docx
@@ -26,7 +26,7 @@
         <w:jc w:val="center"/>
       </w:pPr>
       <w:r>
-        <w:t>Alder Ridge Mechanical • Review through July 5, 2026 • Internal working paper</w:t>
+        <w:t>Alder Ridge Mechanical • Review through July 5, 2026</w:t>
       </w:r>
     </w:p>
     <w:p>
@@ -2256,7 +2256,7 @@
         <w:color w:val="5F6368"/>
         <w:sz w:val="16"/>
       </w:rPr>
-      <w:t xml:space="preserve">Internal finance working paper | Page </w:t>
+      <w:t xml:space="preserve">Page </w:t>
     </w:r>
     <w:r>
       <w:rPr>

</xml_diff>